<commit_message>
chore: prepare GitHub backup and Pages deployment
</commit_message>
<xml_diff>
--- a/個人開戶申請表（VC版本-已更新）.docx
+++ b/個人開戶申請表（VC版本-已更新）.docx
@@ -760,7 +760,16 @@
           <w:rFonts w:ascii="宋体" w:eastAsia="宋体"/>
           <w:spacing w:val="-6"/>
         </w:rPr>
-        <w:t>新西蘭奧克蘭市中心 SHORTLAND STREET 48 號 8 樓，郵編 1010（轉交 LANE NEAVE）</w:t>
+        <w:t>新西蘭奧克蘭市中心 SHOR</w:t>
+      </w:r>
+      <w:bookmarkStart w:id="0" w:name="_GoBack"/>
+      <w:bookmarkEnd w:id="0"/>
+      <w:r>
+        <w:rPr>
+          <w:rFonts w:ascii="宋体" w:eastAsia="宋体"/>
+          <w:spacing w:val="-6"/>
+        </w:rPr>
+        <w:t>TLAND STREET 48 號 8 樓，郵編 1010（轉交 LANE NEAVE）</w:t>
       </w:r>
     </w:p>
     <w:p>
@@ -1190,17 +1199,7 @@
                 <w:spacing w:val="-2"/>
                 <w:sz w:val="17"/>
               </w:rPr>
-              <w:t>保證</w:t>
-            </w:r>
-            <w:bookmarkStart w:id="0" w:name="_GoBack"/>
-            <w:bookmarkEnd w:id="0"/>
-            <w:r>
-              <w:rPr>
-                <w:rFonts w:ascii="宋体" w:eastAsia="宋体"/>
-                <w:spacing w:val="-2"/>
-                <w:sz w:val="17"/>
-              </w:rPr>
-              <w:t>金</w:t>
+              <w:t>保證金</w:t>
             </w:r>
             <w:r>
               <w:rPr>
@@ -5852,6 +5851,7 @@
             <w:pPr>
               <w:pStyle w:val="5"/>
               <w:numPr>
+                <w:ilvl w:val="0"/>
                 <w:numId w:val="0"/>
               </w:numPr>
               <w:tabs>
@@ -6149,6 +6149,7 @@
             <w:pPr>
               <w:pStyle w:val="5"/>
               <w:numPr>
+                <w:ilvl w:val="0"/>
                 <w:numId w:val="0"/>
               </w:numPr>
               <w:tabs>
@@ -25620,7 +25621,16 @@
       <w:rFonts w:eastAsia="黑体"/>
     </w:rPr>
   </w:style>
-  <w:style w:type="table" w:customStyle="1" w:styleId="6">
+  <w:style w:type="paragraph" w:styleId="6">
+    <w:name w:val="List Paragraph"/>
+    <w:basedOn w:val="1"/>
+    <w:qFormat/>
+    <w:uiPriority w:val="1"/>
+    <w:rPr>
+      <w:lang w:val="en-US" w:eastAsia="en-US" w:bidi="ar-SA"/>
+    </w:rPr>
+  </w:style>
+  <w:style w:type="table" w:customStyle="1" w:styleId="7">
     <w:name w:val="Table Normal"/>
     <w:semiHidden/>
     <w:unhideWhenUsed/>
@@ -25634,15 +25644,6 @@
         <w:right w:w="0" w:type="dxa"/>
       </w:tblCellMar>
     </w:tblPr>
-  </w:style>
-  <w:style w:type="paragraph" w:styleId="7">
-    <w:name w:val="List Paragraph"/>
-    <w:basedOn w:val="1"/>
-    <w:qFormat/>
-    <w:uiPriority w:val="1"/>
-    <w:rPr>
-      <w:lang w:val="en-US" w:eastAsia="en-US" w:bidi="ar-SA"/>
-    </w:rPr>
   </w:style>
 </w:styles>
 </file>

</xml_diff>